<commit_message>
docs: Get-sqmServersFromOU + Register-sqmBackupExcludeTrigger in Referenz und Handbuch
- sqmSQLTool-reference.html: 2 neue Funktionskarten, Nav-Zaehler 9->11, Uebersicht 128->130
- Kurzanleitung.docx: Get-sqmServersFromOU in Schnell-Referenz-Tabelle ergaenzt

Co-Authored-By: Claude Sonnet 4.6 <noreply@anthropic.com>
</commit_message>
<xml_diff>
--- a/Docs/sqmSQLTool_Admin-Kurzanleitung.docx
+++ b/Docs/sqmSQLTool_Admin-Kurzanleitung.docx
@@ -4890,6 +4890,66 @@
                 <w:szCs w:val="20"/>
               </w:rPr>
               <w:t xml:space="preserve">Ola-Hallengren-Wartungsjobs anlegen (Cleanup, History-Bereinigung)</w:t>
+            </w:r>
+          </w:p>
+        </w:tc>
+      </w:tr>
+      <w:tr>
+        <w:tc>
+          <w:tcPr>
+            <w:tcW w:type="dxa" w:w="3500"/>
+            <w:tcBorders>
+              <w:top w:val="single" w:color="CCCCCC" w:sz="4"/>
+              <w:left w:val="single" w:color="CCCCCC" w:sz="4"/>
+              <w:bottom w:val="single" w:color="CCCCCC" w:sz="4"/>
+              <w:right w:val="single" w:color="CCCCCC" w:sz="4"/>
+            </w:tcBorders>
+            <w:shd w:fill="F2F2F2" w:val="clear"/>
+            <w:tcMar>
+              <w:top w:type="dxa" w:w="80"/>
+              <w:left w:type="dxa" w:w="160"/>
+              <w:bottom w:type="dxa" w:w="80"/>
+              <w:right w:type="dxa" w:w="160"/>
+            </w:tcMar>
+          </w:tcPr>
+          <w:p>
+            <w:r>
+              <w:rPr>
+                <w:rFonts w:ascii="Consolas" w:cs="Consolas" w:eastAsia="Consolas" w:hAnsi="Consolas"/>
+                <w:color w:val="2E75B6"/>
+                <w:sz w:val="19"/>
+                <w:szCs w:val="19"/>
+              </w:rPr>
+              <w:t xml:space="preserve">Get-sqmServersFromOU</w:t>
+            </w:r>
+          </w:p>
+        </w:tc>
+        <w:tc>
+          <w:tcPr>
+            <w:tcW w:type="dxa" w:w="5526"/>
+            <w:tcBorders>
+              <w:top w:val="single" w:color="CCCCCC" w:sz="4"/>
+              <w:left w:val="single" w:color="CCCCCC" w:sz="4"/>
+              <w:bottom w:val="single" w:color="CCCCCC" w:sz="4"/>
+              <w:right w:val="single" w:color="CCCCCC" w:sz="4"/>
+            </w:tcBorders>
+            <w:shd w:fill="F2F2F2" w:val="clear"/>
+            <w:tcMar>
+              <w:top w:type="dxa" w:w="80"/>
+              <w:left w:type="dxa" w:w="160"/>
+              <w:bottom w:type="dxa" w:w="80"/>
+              <w:right w:type="dxa" w:w="160"/>
+            </w:tcMar>
+          </w:tcPr>
+          <w:p>
+            <w:r>
+              <w:rPr>
+                <w:rFonts w:ascii="Arial" w:cs="Arial" w:eastAsia="Arial" w:hAnsi="Arial"/>
+                <w:color w:val="1A1A1A"/>
+                <w:sz w:val="20"/>
+                <w:szCs w:val="20"/>
+              </w:rPr>
+              <w:t xml:space="preserve">Alle Computer einer AD-OU ermitteln (z. B. „srvDatabase“) und als pipefaehige Objekte ausgeben — direkt an beliebige sqmSQLTool-Funktionen weiterleitbar</w:t>
             </w:r>
           </w:p>
         </w:tc>

</xml_diff>

<commit_message>
v1.8.9.0: Fix CREATE/DROP PROCEDURE DDL prefix + Set-DbaAgentJobStep -StepId; update Admin-Kurzanleitung
Co-Authored-By: Claude Sonnet 4.6 <noreply@anthropic.com>
</commit_message>
<xml_diff>
--- a/Docs/sqmSQLTool_Admin-Kurzanleitung.docx
+++ b/Docs/sqmSQLTool_Admin-Kurzanleitung.docx
@@ -412,7 +412,7 @@
                 <w:sz w:val="20"/>
                 <w:szCs w:val="20"/>
               </w:rPr>
-              <w:t xml:space="preserve">Legt master.dbo.sqm_BackupExclude an (falls nicht vorhanden) und fuegt alle vorhandenen Datenbanken mit IsActive=1 ein. tempdb wird immer uebersprungen.</w:t>
+              <w:t xml:space="preserve">Legt master.dbo.sqm_BackupExclude an (falls nicht vorhanden) und fuegt alle vorhandenen Datenbanken mit IsActive=1 ein. tempdb wird immer uebersprungen. Ab v1.8.8: wird automatisch durch New-sqmOlaUsrDbBackupJob -UseExcludeTable ausgefuehrt.</w:t>
             </w:r>
           </w:p>
         </w:tc>
@@ -721,7 +721,7 @@
                 <w:sz w:val="20"/>
                 <w:szCs w:val="20"/>
               </w:rPr>
-              <w:t xml:space="preserve">Registriert den DDL-Trigger trg_sqm_BackupExclude_AutoSync (ON ALL SERVER). Feiert bei CREATE_DATABASE (neue DB aufnehmen, IsActive=1) und DROP_DATABASE (geloeschte DB als verwaist markieren, IsOrphaned=1). In AlwaysOn-Umgebungen wird der Trigger automatisch auf allen Secondaries registriert. Voraussetzung: Sync-sqmBackupExcludeTable muss zuerst ausgefuehrt worden sein.</w:t>
+              <w:t xml:space="preserve">Registriert den DDL-Trigger trg_sqm_BackupExclude_AutoSync (ON ALL SERVER). Feiert bei CREATE_DATABASE (neue DB aufnehmen, IsActive=1) und DROP_DATABASE (geloeschte DB als verwaist markieren, IsOrphaned=1). In AlwaysOn-Umgebungen wird der Trigger automatisch auf allen Secondaries registriert. Voraussetzung: Sync-sqmBackupExcludeTable muss zuerst ausgefuehrt worden sein. Ab v1.8.8: wird automatisch durch New-sqmOlaUsrDbBackupJob -UseExcludeTable ausgefuehrt.</w:t>
             </w:r>
           </w:p>
         </w:tc>
@@ -3558,7 +3558,7 @@
                 <w:sz w:val="22"/>
                 <w:szCs w:val="22"/>
               </w:rPr>
-              <w:t xml:space="preserve">FULL-Job anlegen</w:t>
+              <w:t xml:space="preserve">Vollstaendige Umgebung anlegen (Ein-Befehl-Setup)</w:t>
             </w:r>
           </w:p>
           <w:p>
@@ -3574,7 +3574,7 @@
                 <w:sz w:val="19"/>
                 <w:szCs w:val="19"/>
               </w:rPr>
-              <w:t xml:space="preserve">New-sqmOlaUsrDbBackupJob -SqlInstance "SQL01" -Full -FullScheduleTime "20:00" -UseExcludeTable</w:t>
+              <w:t xml:space="preserve">New-sqmOlaUsrDbBackupJob -SqlInstance "SQL01" -UseExcludeTable</w:t>
             </w:r>
           </w:p>
           <w:p>
@@ -3590,207 +3590,7 @@
                 <w:sz w:val="20"/>
                 <w:szCs w:val="20"/>
               </w:rPr>
-              <w:t xml:space="preserve">Erstellt den FULL-Job (taegliche Vollsicherung um 20:00 Uhr). -UseExcludeTable richtet Ausschlussliste und DDL-Trigger automatisch ein.</w:t>
-            </w:r>
-          </w:p>
-        </w:tc>
-      </w:tr>
-      <w:tr>
-        <w:tc>
-          <w:tcPr>
-            <w:tcW w:type="dxa" w:w="500"/>
-            <w:tcBorders>
-              <w:top w:val="single" w:color="DDDDDD" w:sz="4"/>
-              <w:left w:val="single" w:color="DDDDDD" w:sz="4"/>
-              <w:bottom w:val="single" w:color="DDDDDD" w:sz="4"/>
-              <w:right w:val="single" w:color="DDDDDD" w:sz="4"/>
-            </w:tcBorders>
-            <w:shd w:fill="2E75B6" w:val="clear"/>
-            <w:tcMar>
-              <w:top w:type="dxa" w:w="100"/>
-              <w:left w:type="dxa" w:w="140"/>
-              <w:bottom w:type="dxa" w:w="100"/>
-              <w:right w:type="dxa" w:w="140"/>
-            </w:tcMar>
-            <w:vAlign w:val="center"/>
-          </w:tcPr>
-          <w:p>
-            <w:pPr>
-              <w:jc w:val="center"/>
-            </w:pPr>
-            <w:r>
-              <w:rPr>
-                <w:rFonts w:ascii="Arial" w:cs="Arial" w:eastAsia="Arial" w:hAnsi="Arial"/>
-                <w:b/>
-                <w:bCs/>
-                <w:color w:val="FFFFFF"/>
-                <w:sz w:val="26"/>
-                <w:szCs w:val="26"/>
-              </w:rPr>
-              <w:t xml:space="preserve">2</w:t>
-            </w:r>
-          </w:p>
-        </w:tc>
-        <w:tc>
-          <w:tcPr>
-            <w:tcW w:type="dxa" w:w="8526"/>
-            <w:tcBorders>
-              <w:top w:val="single" w:color="DDDDDD" w:sz="4"/>
-              <w:left w:val="single" w:color="DDDDDD" w:sz="4"/>
-              <w:bottom w:val="single" w:color="DDDDDD" w:sz="4"/>
-              <w:right w:val="single" w:color="DDDDDD" w:sz="4"/>
-            </w:tcBorders>
-            <w:shd w:fill="F8F8F8" w:val="clear"/>
-            <w:tcMar>
-              <w:top w:type="dxa" w:w="120"/>
-              <w:left w:type="dxa" w:w="200"/>
-              <w:bottom w:type="dxa" w:w="80"/>
-              <w:right w:type="dxa" w:w="200"/>
-            </w:tcMar>
-          </w:tcPr>
-          <w:p>
-            <w:r>
-              <w:rPr>
-                <w:rFonts w:ascii="Arial" w:cs="Arial" w:eastAsia="Arial" w:hAnsi="Arial"/>
-                <w:b/>
-                <w:bCs/>
-                <w:color w:val="1F3864"/>
-                <w:sz w:val="22"/>
-                <w:szCs w:val="22"/>
-              </w:rPr>
-              <w:t xml:space="preserve">LOG-Job anlegen</w:t>
-            </w:r>
-          </w:p>
-          <w:p>
-            <w:pPr>
-              <w:shd w:fill="1E1E1E" w:val="clear"/>
-              <w:spacing w:after="4" w:before="80"/>
-              <w:ind w:left="240" w:right="240"/>
-            </w:pPr>
-            <w:r>
-              <w:rPr>
-                <w:rFonts w:ascii="Consolas" w:cs="Consolas" w:eastAsia="Consolas" w:hAnsi="Consolas"/>
-                <w:color w:val="9CDCFE"/>
-                <w:sz w:val="19"/>
-                <w:szCs w:val="19"/>
-              </w:rPr>
-              <w:t xml:space="preserve">New-sqmOlaUsrDbBackupJob -SqlInstance "SQL01" -Log -LogScheduleIntervalMinutes 15</w:t>
-            </w:r>
-          </w:p>
-          <w:p>
-            <w:pPr>
-              <w:spacing w:after="0" w:before="40"/>
-            </w:pPr>
-            <w:r>
-              <w:rPr>
-                <w:rFonts w:ascii="Arial" w:cs="Arial" w:eastAsia="Arial" w:hAnsi="Arial"/>
-                <w:i/>
-                <w:iCs/>
-                <w:color w:val="595959"/>
-                <w:sz w:val="20"/>
-                <w:szCs w:val="20"/>
-              </w:rPr>
-              <w:t xml:space="preserve">Erstellt den LOG-Job (Ausfuehrung alle 15 Minuten). Setzt einen vorherigen FULL-Job voraus.</w:t>
-            </w:r>
-          </w:p>
-        </w:tc>
-      </w:tr>
-      <w:tr>
-        <w:tc>
-          <w:tcPr>
-            <w:tcW w:type="dxa" w:w="500"/>
-            <w:tcBorders>
-              <w:top w:val="single" w:color="DDDDDD" w:sz="4"/>
-              <w:left w:val="single" w:color="DDDDDD" w:sz="4"/>
-              <w:bottom w:val="single" w:color="DDDDDD" w:sz="4"/>
-              <w:right w:val="single" w:color="DDDDDD" w:sz="4"/>
-            </w:tcBorders>
-            <w:shd w:fill="2E75B6" w:val="clear"/>
-            <w:tcMar>
-              <w:top w:type="dxa" w:w="100"/>
-              <w:left w:type="dxa" w:w="140"/>
-              <w:bottom w:type="dxa" w:w="100"/>
-              <w:right w:type="dxa" w:w="140"/>
-            </w:tcMar>
-            <w:vAlign w:val="center"/>
-          </w:tcPr>
-          <w:p>
-            <w:pPr>
-              <w:jc w:val="center"/>
-            </w:pPr>
-            <w:r>
-              <w:rPr>
-                <w:rFonts w:ascii="Arial" w:cs="Arial" w:eastAsia="Arial" w:hAnsi="Arial"/>
-                <w:b/>
-                <w:bCs/>
-                <w:color w:val="FFFFFF"/>
-                <w:sz w:val="26"/>
-                <w:szCs w:val="26"/>
-              </w:rPr>
-              <w:t xml:space="preserve">3</w:t>
-            </w:r>
-          </w:p>
-        </w:tc>
-        <w:tc>
-          <w:tcPr>
-            <w:tcW w:type="dxa" w:w="8526"/>
-            <w:tcBorders>
-              <w:top w:val="single" w:color="DDDDDD" w:sz="4"/>
-              <w:left w:val="single" w:color="DDDDDD" w:sz="4"/>
-              <w:bottom w:val="single" w:color="DDDDDD" w:sz="4"/>
-              <w:right w:val="single" w:color="DDDDDD" w:sz="4"/>
-            </w:tcBorders>
-            <w:shd w:fill="F8F8F8" w:val="clear"/>
-            <w:tcMar>
-              <w:top w:type="dxa" w:w="120"/>
-              <w:left w:type="dxa" w:w="200"/>
-              <w:bottom w:type="dxa" w:w="80"/>
-              <w:right w:type="dxa" w:w="200"/>
-            </w:tcMar>
-          </w:tcPr>
-          <w:p>
-            <w:r>
-              <w:rPr>
-                <w:rFonts w:ascii="Arial" w:cs="Arial" w:eastAsia="Arial" w:hAnsi="Arial"/>
-                <w:b/>
-                <w:bCs/>
-                <w:color w:val="1F3864"/>
-                <w:sz w:val="22"/>
-                <w:szCs w:val="22"/>
-              </w:rPr>
-              <w:t xml:space="preserve">FULL + LOG in einem Aufruf (empfohlen)</w:t>
-            </w:r>
-          </w:p>
-          <w:p>
-            <w:pPr>
-              <w:shd w:fill="1E1E1E" w:val="clear"/>
-              <w:spacing w:after="4" w:before="80"/>
-              <w:ind w:left="240" w:right="240"/>
-            </w:pPr>
-            <w:r>
-              <w:rPr>
-                <w:rFonts w:ascii="Consolas" w:cs="Consolas" w:eastAsia="Consolas" w:hAnsi="Consolas"/>
-                <w:color w:val="9CDCFE"/>
-                <w:sz w:val="19"/>
-                <w:szCs w:val="19"/>
-              </w:rPr>
-              <w:t xml:space="preserve">New-sqmOlaUsrDbBackupJob -SqlInstance "SQL01" -Full -Log -UseExcludeTable</w:t>
-            </w:r>
-          </w:p>
-          <w:p>
-            <w:pPr>
-              <w:spacing w:after="0" w:before="40"/>
-            </w:pPr>
-            <w:r>
-              <w:rPr>
-                <w:rFonts w:ascii="Arial" w:cs="Arial" w:eastAsia="Arial" w:hAnsi="Arial"/>
-                <w:i/>
-                <w:iCs/>
-                <w:color w:val="595959"/>
-                <w:sz w:val="20"/>
-                <w:szCs w:val="20"/>
-              </w:rPr>
-              <w:t xml:space="preserve">Richtet FULL (21:15 taeglich, FITS-Standard) und LOG (alle 15 Min) in einem Schritt ein. DIFF wird automatisch deaktiviert wenn kein bestehender Job vorhanden. Existiert bereits ein Job, werden Zeit und Pfad automatisch uebernommen.</w:t>
+              <w:t xml:space="preserve">Erstellt FULL-Job (taeglich 21:15), LOG-Job (alle 15 Min) sowie alle Infrastruktur-Objekte: Tabelle sqm_BackupExclude, DDL-Trigger, gespeicherte Prozeduren in master und Sync-Job (alle 30 Min). Mit -CreateSyncJob:$false deaktivierbar.</w:t>
             </w:r>
           </w:p>
         </w:tc>
@@ -3939,7 +3739,7 @@
                 <w:sz w:val="20"/>
                 <w:szCs w:val="20"/>
               </w:rPr>
-              <w:t xml:space="preserve">Schalter fuer die gewuenschten Job-Typen (einzeln oder kombiniert)</w:t>
+              <w:t xml:space="preserve">Schalter fuer die gewuenschten Job-Typen (einzeln oder kombiniert). Ohne Angabe: FULL und LOG werden automatisch angelegt.</w:t>
             </w:r>
           </w:p>
         </w:tc>
@@ -4240,6 +4040,66 @@
                 <w:szCs w:val="20"/>
               </w:rPr>
               <w:t xml:space="preserve">Verhindert automatische Weitergabe an AlwaysOn-Secondaries (wird intern verwendet)</w:t>
+            </w:r>
+          </w:p>
+        </w:tc>
+      </w:tr>
+      <w:tr>
+        <w:tc>
+          <w:tcPr>
+            <w:tcW w:type="dxa" w:w="2800"/>
+            <w:tcBorders>
+              <w:top w:val="single" w:color="CCCCCC" w:sz="4"/>
+              <w:left w:val="single" w:color="CCCCCC" w:sz="4"/>
+              <w:bottom w:val="single" w:color="CCCCCC" w:sz="4"/>
+              <w:right w:val="single" w:color="CCCCCC" w:sz="4"/>
+            </w:tcBorders>
+            <w:shd w:fill="FFFFFF" w:val="clear"/>
+            <w:tcMar>
+              <w:top w:type="dxa" w:w="80"/>
+              <w:left w:type="dxa" w:w="160"/>
+              <w:bottom w:type="dxa" w:w="80"/>
+              <w:right w:type="dxa" w:w="160"/>
+            </w:tcMar>
+          </w:tcPr>
+          <w:p>
+            <w:r>
+              <w:rPr>
+                <w:rFonts w:ascii="Consolas" w:cs="Consolas" w:eastAsia="Consolas" w:hAnsi="Consolas"/>
+                <w:color w:val="2E75B6"/>
+                <w:sz w:val="19"/>
+                <w:szCs w:val="19"/>
+              </w:rPr>
+              <w:t xml:space="preserve">-CreateSyncJob [bool]</w:t>
+            </w:r>
+          </w:p>
+        </w:tc>
+        <w:tc>
+          <w:tcPr>
+            <w:tcW w:type="dxa" w:w="6226"/>
+            <w:tcBorders>
+              <w:top w:val="single" w:color="CCCCCC" w:sz="4"/>
+              <w:left w:val="single" w:color="CCCCCC" w:sz="4"/>
+              <w:bottom w:val="single" w:color="CCCCCC" w:sz="4"/>
+              <w:right w:val="single" w:color="CCCCCC" w:sz="4"/>
+            </w:tcBorders>
+            <w:shd w:fill="FFFFFF" w:val="clear"/>
+            <w:tcMar>
+              <w:top w:type="dxa" w:w="80"/>
+              <w:left w:type="dxa" w:w="160"/>
+              <w:bottom w:type="dxa" w:w="80"/>
+              <w:right w:type="dxa" w:w="160"/>
+            </w:tcMar>
+          </w:tcPr>
+          <w:p>
+            <w:r>
+              <w:rPr>
+                <w:rFonts w:ascii="Arial" w:cs="Arial" w:eastAsia="Arial" w:hAnsi="Arial"/>
+                <w:color w:val="1A1A1A"/>
+                <w:sz w:val="20"/>
+                <w:szCs w:val="20"/>
+              </w:rPr>
+              <w:t xml:space="preserve">Legt SQL Agent Job sqm BackupExclude - SYNC an (alle 30 Min). Standard: $true. Nur mit -UseExcludeTable wirksam.</w:t>
             </w:r>
           </w:p>
         </w:tc>
@@ -4829,7 +4689,7 @@
                 <w:sz w:val="20"/>
                 <w:szCs w:val="20"/>
               </w:rPr>
-              <w:t xml:space="preserve">FULL-, DIFF-, LOG-Sicherungsjobs fuer alle Benutzerdatenbanken anlegen</w:t>
+              <w:t xml:space="preserve">FULL- und LOG-Sicherungsjobs anlegen. Mit -UseExcludeTable: vollstaendige Umgebung in einem Befehl (inkl. sqm_BackupExclude, DDL-Trigger, Sync-Job)</w:t>
             </w:r>
           </w:p>
         </w:tc>

</xml_diff>

<commit_message>
v1.8.15.0: Docs - add "einfache Version" to Admin-Kurzanleitung Teil 1
Teil 1 (Backup-Ausschlussliste einrichten) described only the four manual setup
steps. Added a recommended one-liner box before the detailed walkthrough:
New-sqmOlaUsrDbBackupJob -UseExcludeTable already runs Sync-sqmBackupExcludeTable
and Register-sqmBackupExcludeTrigger automatically (steps 1 and 4). Steps 2
(group permission) and 3 (ongoing GUI management) remain separate. Detail
heading relabeled to clarify it is now optional/manual reference material.
</commit_message>
<xml_diff>
--- a/Docs/sqmSQLTool_Admin-Kurzanleitung.docx
+++ b/Docs/sqmSQLTool_Admin-Kurzanleitung.docx
@@ -273,6 +273,112 @@
         <w:t xml:space="preserve"/>
       </w:r>
     </w:p>
+    <w:tbl>
+      <w:tblPr>
+        <w:tblW w:type="dxa" w:w="9026"/>
+        <w:tblBorders>
+          <w:top w:val="single" w:color="auto" w:sz="4"/>
+          <w:left w:val="single" w:color="auto" w:sz="4"/>
+          <w:bottom w:val="single" w:color="auto" w:sz="4"/>
+          <w:right w:val="single" w:color="auto" w:sz="4"/>
+          <w:insideH w:val="single" w:color="auto" w:sz="4"/>
+          <w:insideV w:val="single" w:color="auto" w:sz="4"/>
+        </w:tblBorders>
+      </w:tblPr>
+      <w:tblGrid>
+        <w:gridCol w:w="9026"/>
+      </w:tblGrid>
+      <w:tr>
+        <w:tc>
+          <w:tcPr>
+            <w:tcW w:type="dxa" w:w="9026"/>
+            <w:tcBorders>
+              <w:top w:val="single" w:color="375623" w:sz="12"/>
+              <w:left w:val="single" w:color="CCCCCC" w:sz="4"/>
+              <w:bottom w:val="single" w:color="CCCCCC" w:sz="4"/>
+              <w:right w:val="single" w:color="CCCCCC" w:sz="4"/>
+            </w:tcBorders>
+            <w:shd w:fill="E2EFDA" w:val="clear"/>
+            <w:tcMar>
+              <w:top w:type="dxa" w:w="120"/>
+              <w:left w:type="dxa" w:w="200"/>
+              <w:bottom w:type="dxa" w:w="120"/>
+              <w:right w:type="dxa" w:w="200"/>
+            </w:tcMar>
+          </w:tcPr>
+          <w:p>
+            <w:pPr>
+              <w:spacing w:after="40" w:before="0"/>
+            </w:pPr>
+            <w:r>
+              <w:rPr>
+                <w:rFonts w:ascii="Arial" w:cs="Arial" w:eastAsia="Arial" w:hAnsi="Arial"/>
+                <w:b/>
+                <w:bCs/>
+                <w:color w:val="375623"/>
+                <w:sz w:val="20"/>
+                <w:szCs w:val="20"/>
+              </w:rPr>
+              <w:t xml:space="preserve">Einfache Version (empfohlen, ab v1.8.8)</w:t>
+            </w:r>
+          </w:p>
+          <w:p>
+            <w:pPr>
+              <w:spacing w:after="80" w:before="0"/>
+            </w:pPr>
+            <w:r>
+              <w:rPr>
+                <w:rFonts w:ascii="Arial" w:cs="Arial" w:eastAsia="Arial" w:hAnsi="Arial"/>
+                <w:color w:val="1A1A1A"/>
+                <w:sz w:val="20"/>
+                <w:szCs w:val="20"/>
+              </w:rPr>
+              <w:t xml:space="preserve">Statt der vier Einzelschritte unten reicht in der Regel ein einziger Aufruf. New-sqmOlaUsrDbBackupJob fuehrt Sync-sqmBackupExcludeTable und Register-sqmBackupExcludeTrigger automatisch aus (Schritt 1 und 4), bevor die Backup-Jobs angelegt werden:</w:t>
+            </w:r>
+          </w:p>
+          <w:p>
+            <w:pPr>
+              <w:shd w:fill="1E1E1E" w:val="clear"/>
+              <w:spacing w:after="80" w:before="80"/>
+              <w:ind w:left="240" w:right="240"/>
+            </w:pPr>
+            <w:r>
+              <w:rPr>
+                <w:rFonts w:ascii="Consolas" w:cs="Consolas" w:eastAsia="Consolas" w:hAnsi="Consolas"/>
+                <w:color w:val="9CDCFE"/>
+                <w:sz w:val="19"/>
+                <w:szCs w:val="19"/>
+              </w:rPr>
+              <w:t xml:space="preserve">New-sqmOlaUsrDbBackupJob -SqlInstance "SQL01" -Full -Log -UseExcludeTable</w:t>
+            </w:r>
+          </w:p>
+          <w:p>
+            <w:pPr>
+              <w:spacing w:after="0" w:before="40"/>
+            </w:pPr>
+            <w:r>
+              <w:rPr>
+                <w:rFonts w:ascii="Arial" w:cs="Arial" w:eastAsia="Arial" w:hAnsi="Arial"/>
+                <w:i/>
+                <w:iCs/>
+                <w:color w:val="595959"/>
+                <w:sz w:val="20"/>
+                <w:szCs w:val="20"/>
+              </w:rPr>
+              <w:t xml:space="preserve">Legt Tabelle und DDL-Trigger automatisch an, synchronisiert vorhandene Datenbanken (IsActive=1 = wird gesichert) und erstellt FULL/LOG-Jobs mit dynamischer, laufzeitgenerierter Ausschlussliste. Schritt 2 (Gruppenberechtigung fuer Nicht-Sysadmin-Zugriff) und Schritt 3 (laufende Pflege per GUI) bleiben eigenstaendige, manuelle Schritte. Die Details unten helfen beim Verstehen und bei der Fehlersuche, sind fuer die Ersteinrichtung aber nicht mehr noetig.</w:t>
+            </w:r>
+          </w:p>
+        </w:tc>
+      </w:tr>
+    </w:tbl>
+    <w:p>
+      <w:pPr>
+        <w:spacing w:after="0" w:before="160"/>
+      </w:pPr>
+      <w:r>
+        <w:t xml:space="preserve"/>
+      </w:r>
+    </w:p>
     <w:p>
       <w:pPr>
         <w:pStyle w:val="Heading2"/>
@@ -287,7 +393,7 @@
           <w:sz w:val="24"/>
           <w:szCs w:val="24"/>
         </w:rPr>
-        <w:t xml:space="preserve">Schritt-fuer-Schritt Einrichtung</w:t>
+        <w:t xml:space="preserve">Im Detail: die vier Einzelschritte (manuell, optional)</w:t>
       </w:r>
     </w:p>
     <w:p>

</xml_diff>